<commit_message>
Binding traverser parity phase 2: verify w15:dataBinding
CR-binding-traverser-parity phase 2.  A w15:dataBinding (Word 2013)
bound sdt is handled by the phase 1 shared path in all three traverser
implementations, because SdtPr.getDataBinding() returns any
CTDataBinding regardless of namespace; TextBindParityTest now covers it
(identical output across implementations).

Finding recorded in the CR: no docPartGallery exclusion alignment is
needed - bind.xslt's not(w:sdtPr/w:docPartGallery) tests a direct child
which never occurs (the gallery element lives inside w:docPartObj), so
the exclusion is vacuous there too and behavior was already consistent.

Co-Authored-By: Claude Fable 5 <noreply@anthropic.com>
Claude-Session: https://claude.ai/code/session_01KNvDdgutG1UJByi9MbxhF4
</commit_message>
<xml_diff>
--- a/docx4j-core-tests/src/test/resources/OpenDoPE/text-bind-parity.docx
+++ b/docx4j-core-tests/src/test/resources/OpenDoPE/text-bind-parity.docx
@@ -414,6 +414,23 @@
         </w:tbl>
       </w:sdtContent>
     </w:sdt>
+    <w:p>
+      <w:r>
+        <w:t xml:space="preserve">W15: </w:t>
+      </w:r>
+      <w:sdt>
+        <w:sdtPr>
+          <w:id w:val="811111113"/>
+          <w15:dataBinding w:xpath="/templateSource[1]/body[1]/root[1]/header[1]/lastname[1]" w:storeItemID="{6A47349F-7005-4A97-AE9A-450217272349}"/>
+          <w:text/>
+        </w:sdtPr>
+        <w:sdtContent>
+          <w:r>
+            <w:t>W15OLD</w:t>
+          </w:r>
+        </w:sdtContent>
+      </w:sdt>
+    </w:p>
     <w:sectPr>
       <w:pgSz w:w="11906" w:h="16838"/>
       <w:pgMar w:top="1440" w:right="1440" w:bottom="1440" w:left="1440" w:header="708" w:footer="708" w:gutter="0"/>

</xml_diff>